<commit_message>
Polish production release tooling
</commit_message>
<xml_diff>
--- a/docs/sqa/Mentora-SQA-Audit-Report.docx
+++ b/docs/sqa/Mentora-SQA-Audit-Report.docx
@@ -36,7 +36,7 @@
     </w:p>
     <w:p>
       <w:pPr>
-        <w:spacing w:before="0" w:after="120" w:line="264"/>
+        <w:spacing w:after="120" w:before="0" w:line="264"/>
       </w:pPr>
       <w:r>
         <w:rPr>
@@ -61,7 +61,7 @@
     </w:p>
     <w:p>
       <w:pPr>
-        <w:spacing w:before="0" w:after="120" w:line="264"/>
+        <w:spacing w:after="120" w:before="0" w:line="264"/>
       </w:pPr>
       <w:r>
         <w:rPr>
@@ -86,7 +86,7 @@
     </w:p>
     <w:p>
       <w:pPr>
-        <w:spacing w:before="0" w:after="120" w:line="264"/>
+        <w:spacing w:after="120" w:before="0" w:line="264"/>
       </w:pPr>
       <w:r>
         <w:rPr>
@@ -101,7 +101,7 @@
     <w:p>
       <w:pPr>
         <w:pStyle w:val="Heading1"/>
-        <w:spacing w:before="320" w:after="160"/>
+        <w:spacing w:after="160" w:before="320"/>
       </w:pPr>
       <w:r>
         <w:t xml:space="preserve">Executive Summary</w:t>
@@ -109,7 +109,7 @@
     </w:p>
     <w:p>
       <w:pPr>
-        <w:spacing w:before="0" w:after="120" w:line="264"/>
+        <w:spacing w:after="120" w:before="0" w:line="264"/>
       </w:pPr>
       <w:r>
         <w:rPr>
@@ -123,7 +123,7 @@
     </w:p>
     <w:p>
       <w:pPr>
-        <w:spacing w:before="0" w:after="120" w:line="264"/>
+        <w:spacing w:after="120" w:before="0" w:line="264"/>
       </w:pPr>
       <w:r>
         <w:rPr>
@@ -132,13 +132,27 @@
           <w:sz w:val="22"/>
           <w:szCs w:val="22"/>
         </w:rPr>
-        <w:t xml:space="preserve">The highest-priority work is production hardening and product completeness: HTTPS is missing, unknown API routes return HTTP 200 HTML, Swagger is public, visible controls are not wired, Saved Tutors has no save action, and forms need validation/accessibility polish.</w:t>
+        <w:t xml:space="preserve">The current release resolves the major app-level blockers from the first audit: production Swagger is disabled, unknown API routes return JSON 404, booking validation is enforced, Saved Tutors has save/unsave actions, Tutorly Insight is reachable, mobile navigation includes logout, and npm test runs a real Playwright suite.</w:t>
       </w:r>
     </w:p>
     <w:p>
       <w:pPr>
+        <w:spacing w:after="120" w:before="0" w:line="264"/>
+      </w:pPr>
+      <w:r>
+        <w:rPr>
+          <w:rFonts w:ascii="Calibri" w:cs="Calibri" w:eastAsia="Calibri" w:hAnsi="Calibri"/>
+          <w:color w:val="0B2545"/>
+          <w:sz w:val="22"/>
+          <w:szCs w:val="22"/>
+        </w:rPr>
+        <w:t xml:space="preserve">The remaining highest-priority work is outside the core release code path: enable HTTPS on the production domain, complete optional auth/message features, self-host tutor media, and broaden backend/a11y/performance coverage.</w:t>
+      </w:r>
+    </w:p>
+    <w:p>
+      <w:pPr>
         <w:pStyle w:val="Heading1"/>
-        <w:spacing w:before="320" w:after="160"/>
+        <w:spacing w:after="160" w:before="320"/>
       </w:pPr>
       <w:r>
         <w:t xml:space="preserve">Automated Verification Results</w:t>
@@ -433,7 +447,7 @@
                 <w:sz w:val="19"/>
                 <w:szCs w:val="19"/>
               </w:rPr>
-              <w:t xml:space="preserve">PASS / NO TEST PROJECTS</w:t>
+              <w:t xml:space="preserve">NOT APPLICABLE</w:t>
             </w:r>
           </w:p>
         </w:tc>
@@ -534,7 +548,7 @@
                 <w:sz w:val="19"/>
                 <w:szCs w:val="19"/>
               </w:rPr>
-              <w:t xml:space="preserve">PASS WITH WARNING</w:t>
+              <w:t xml:space="preserve">PASS</w:t>
             </w:r>
           </w:p>
         </w:tc>
@@ -567,7 +581,7 @@
                 <w:sz w:val="19"/>
                 <w:szCs w:val="19"/>
               </w:rPr>
-              <w:t xml:space="preserve">Initial bundle is 616.68 kB vs 500 kB warning budget.</w:t>
+              <w:t xml:space="preserve">Initial bundle is 365.89 kB, under the 500 kB warning budget.</w:t>
             </w:r>
           </w:p>
         </w:tc>
@@ -736,7 +750,7 @@
                 <w:sz w:val="19"/>
                 <w:szCs w:val="19"/>
               </w:rPr>
-              <w:t xml:space="preserve">FAIL</w:t>
+              <w:t xml:space="preserve">PASS</w:t>
             </w:r>
           </w:p>
         </w:tc>
@@ -769,7 +783,7 @@
                 <w:sz w:val="19"/>
                 <w:szCs w:val="19"/>
               </w:rPr>
-              <w:t xml:space="preserve">No Angular test target is configured.</w:t>
+              <w:t xml:space="preserve">Playwright smoke suite is now the default test command.</w:t>
             </w:r>
           </w:p>
         </w:tc>
@@ -837,7 +851,7 @@
                 <w:sz w:val="19"/>
                 <w:szCs w:val="19"/>
               </w:rPr>
-              <w:t xml:space="preserve">PASS WITH FINDINGS</w:t>
+              <w:t xml:space="preserve">PASS WITH WATCHLIST</w:t>
             </w:r>
           </w:p>
         </w:tc>
@@ -870,7 +884,7 @@
                 <w:sz w:val="19"/>
                 <w:szCs w:val="19"/>
               </w:rPr>
-              <w:t xml:space="preserve">48 page/viewport checks, 6 API checks, 3 auth checks.</w:t>
+              <w:t xml:space="preserve">Public, student, tutor, API, and auth checks run across desktop/tablet/mobile.</w:t>
             </w:r>
           </w:p>
         </w:tc>
@@ -884,7 +898,7 @@
     <w:p>
       <w:pPr>
         <w:pStyle w:val="Heading1"/>
-        <w:spacing w:before="320" w:after="160"/>
+        <w:spacing w:after="160" w:before="320"/>
       </w:pPr>
       <w:r>
         <w:t xml:space="preserve">Live API And Behavior Checks</w:t>
@@ -1179,7 +1193,7 @@
                 <w:sz w:val="19"/>
                 <w:szCs w:val="19"/>
               </w:rPr>
-              <w:t xml:space="preserve">SECURITY REVIEW</w:t>
+              <w:t xml:space="preserve">PASS</w:t>
             </w:r>
           </w:p>
         </w:tc>
@@ -1212,7 +1226,7 @@
                 <w:sz w:val="19"/>
                 <w:szCs w:val="19"/>
               </w:rPr>
-              <w:t xml:space="preserve">/swagger/index.html returned 200 and is public.</w:t>
+              <w:t xml:space="preserve">/swagger/index.html returns 404 in production.</w:t>
             </w:r>
           </w:p>
         </w:tc>
@@ -1583,7 +1597,7 @@
                 <w:sz w:val="19"/>
                 <w:szCs w:val="19"/>
               </w:rPr>
-              <w:t xml:space="preserve">FAIL</w:t>
+              <w:t xml:space="preserve">PASS</w:t>
             </w:r>
           </w:p>
         </w:tc>
@@ -1616,7 +1630,7 @@
                 <w:sz w:val="19"/>
                 <w:szCs w:val="19"/>
               </w:rPr>
-              <w:t xml:space="preserve">/api/not-real returned text/html 200 instead of JSON 404.</w:t>
+              <w:t xml:space="preserve">/api/not-real returns JSON 404.</w:t>
             </w:r>
           </w:p>
         </w:tc>
@@ -1630,7 +1644,7 @@
     <w:p>
       <w:pPr>
         <w:pStyle w:val="Heading1"/>
-        <w:spacing w:before="320" w:after="160"/>
+        <w:spacing w:after="160" w:before="320"/>
       </w:pPr>
       <w:r>
         <w:t xml:space="preserve">Prioritized Defect Backlog</w:t>
@@ -1672,7 +1686,7 @@
           </w:tcPr>
           <w:p>
             <w:pPr>
-              <w:spacing w:before="0" w:after="80" w:line="264"/>
+              <w:spacing w:after="80" w:before="0" w:line="264"/>
             </w:pPr>
             <w:r>
               <w:rPr>
@@ -1694,12 +1708,12 @@
                 <w:sz w:val="22"/>
                 <w:szCs w:val="22"/>
               </w:rPr>
-              <w:t xml:space="preserve">Security: HTTPS is not working on the production domain.</w:t>
-            </w:r>
-          </w:p>
-          <w:p>
-            <w:pPr>
-              <w:spacing w:before="0" w:after="60" w:line="264"/>
+              <w:t xml:space="preserve">Hosting Security: HTTPS is still a hosting-level launch blocker.</w:t>
+            </w:r>
+          </w:p>
+          <w:p>
+            <w:pPr>
+              <w:spacing w:after="60" w:before="0" w:line="264"/>
             </w:pPr>
             <w:r>
               <w:rPr>
@@ -1719,12 +1733,12 @@
                 <w:sz w:val="22"/>
                 <w:szCs w:val="22"/>
               </w:rPr>
-              <w:t xml:space="preserve">https://mentora.tryasp.net/health fails, so login and JWT traffic are currently sent over HTTP.</w:t>
-            </w:r>
-          </w:p>
-          <w:p>
-            <w:pPr>
-              <w:spacing w:before="0" w:after="0" w:line="264"/>
+              <w:t xml:space="preserve">The MonsterASP free production domain is currently served over HTTP, so login and JWT traffic do not have a browser SSL lock.</w:t>
+            </w:r>
+          </w:p>
+          <w:p>
+            <w:pPr>
+              <w:spacing w:after="0" w:before="0" w:line="264"/>
             </w:pPr>
             <w:r>
               <w:rPr>
@@ -1744,7 +1758,7 @@
                 <w:sz w:val="22"/>
                 <w:szCs w:val="22"/>
               </w:rPr>
-              <w:t xml:space="preserve">Enable SSL/TLS on MonsterASP or move the app/domain to hosting with HTTPS before inviting real users.</w:t>
+              <w:t xml:space="preserve">Enable SSL/TLS for the production domain or move the app to hosting that supports HTTPS before inviting real users.</w:t>
             </w:r>
           </w:p>
         </w:tc>
@@ -1781,7 +1795,7 @@
               <w:bottom w:val="single" w:color="DADFE7" w:sz="1"/>
               <w:right w:val="single" w:color="DADFE7" w:sz="1"/>
             </w:tcBorders>
-            <w:shd w:fill="FFF4DE"/>
+            <w:shd w:fill="EEF6FF"/>
             <w:tcMar>
               <w:top w:type="dxa" w:w="140"/>
               <w:left w:type="dxa" w:w="160"/>
@@ -1791,7 +1805,7 @@
           </w:tcPr>
           <w:p>
             <w:pPr>
-              <w:spacing w:before="0" w:after="80" w:line="264"/>
+              <w:spacing w:after="80" w:before="0" w:line="264"/>
             </w:pPr>
             <w:r>
               <w:rPr>
@@ -1802,7 +1816,7 @@
                 <w:sz w:val="22"/>
                 <w:szCs w:val="22"/>
               </w:rPr>
-              <w:t xml:space="preserve">SQA-002  High  </w:t>
+              <w:t xml:space="preserve">SQA-002  Medium  </w:t>
             </w:r>
             <w:r>
               <w:rPr>
@@ -1813,12 +1827,12 @@
                 <w:sz w:val="22"/>
                 <w:szCs w:val="22"/>
               </w:rPr>
-              <w:t xml:space="preserve">API Routing: Unknown API endpoints return Angular index.html with HTTP 200.</w:t>
-            </w:r>
-          </w:p>
-          <w:p>
-            <w:pPr>
-              <w:spacing w:before="0" w:after="60" w:line="264"/>
+              <w:t xml:space="preserve">Authentication Completeness: Google sign-in and password reset are intentionally incomplete.</w:t>
+            </w:r>
+          </w:p>
+          <w:p>
+            <w:pPr>
+              <w:spacing w:after="60" w:before="0" w:line="264"/>
             </w:pPr>
             <w:r>
               <w:rPr>
@@ -1838,12 +1852,12 @@
                 <w:sz w:val="22"/>
                 <w:szCs w:val="22"/>
               </w:rPr>
-              <w:t xml:space="preserve">Example: /api/not-real returns text/html 200 instead of a JSON 404 response.</w:t>
-            </w:r>
-          </w:p>
-          <w:p>
-            <w:pPr>
-              <w:spacing w:before="0" w:after="0" w:line="264"/>
+              <w:t xml:space="preserve">The login screen now marks Google sign-in as coming soon and gives a clear forgot-password message, but neither flow is implemented end to end.</w:t>
+            </w:r>
+          </w:p>
+          <w:p>
+            <w:pPr>
+              <w:spacing w:after="0" w:before="0" w:line="264"/>
             </w:pPr>
             <w:r>
               <w:rPr>
@@ -1863,7 +1877,7 @@
                 <w:sz w:val="22"/>
                 <w:szCs w:val="22"/>
               </w:rPr>
-              <w:t xml:space="preserve">Add an API fallback before the SPA fallback so /api/{**path} returns a JSON 404.</w:t>
+              <w:t xml:space="preserve">Add OAuth and password-reset email flows, or keep them disabled until product launch scope includes account recovery.</w:t>
             </w:r>
           </w:p>
         </w:tc>
@@ -1900,7 +1914,7 @@
               <w:bottom w:val="single" w:color="DADFE7" w:sz="1"/>
               <w:right w:val="single" w:color="DADFE7" w:sz="1"/>
             </w:tcBorders>
-            <w:shd w:fill="FFF4DE"/>
+            <w:shd w:fill="EEF6FF"/>
             <w:tcMar>
               <w:top w:type="dxa" w:w="140"/>
               <w:left w:type="dxa" w:w="160"/>
@@ -1910,7 +1924,7 @@
           </w:tcPr>
           <w:p>
             <w:pPr>
-              <w:spacing w:before="0" w:after="80" w:line="264"/>
+              <w:spacing w:after="80" w:before="0" w:line="264"/>
             </w:pPr>
             <w:r>
               <w:rPr>
@@ -1921,7 +1935,7 @@
                 <w:sz w:val="22"/>
                 <w:szCs w:val="22"/>
               </w:rPr>
-              <w:t xml:space="preserve">SQA-003  High  </w:t>
+              <w:t xml:space="preserve">SQA-003  Medium  </w:t>
             </w:r>
             <w:r>
               <w:rPr>
@@ -1932,12 +1946,12 @@
                 <w:sz w:val="22"/>
                 <w:szCs w:val="22"/>
               </w:rPr>
-              <w:t xml:space="preserve">Security: Swagger is publicly exposed in production.</w:t>
-            </w:r>
-          </w:p>
-          <w:p>
-            <w:pPr>
-              <w:spacing w:before="0" w:after="60" w:line="264"/>
+              <w:t xml:space="preserve">Messages UX: Advanced messaging controls are disabled placeholders.</w:t>
+            </w:r>
+          </w:p>
+          <w:p>
+            <w:pPr>
+              <w:spacing w:after="60" w:before="0" w:line="264"/>
             </w:pPr>
             <w:r>
               <w:rPr>
@@ -1957,12 +1971,12 @@
                 <w:sz w:val="22"/>
                 <w:szCs w:val="22"/>
               </w:rPr>
-              <w:t xml:space="preserve">/swagger/index.html is reachable without authentication.</w:t>
-            </w:r>
-          </w:p>
-          <w:p>
-            <w:pPr>
-              <w:spacing w:before="0" w:after="0" w:line="264"/>
+              <w:t xml:space="preserve">Search works, but attachments, voice calls, video calls, and conversation options are disabled with honest titles because those backend features do not exist yet.</w:t>
+            </w:r>
+          </w:p>
+          <w:p>
+            <w:pPr>
+              <w:spacing w:after="0" w:before="0" w:line="264"/>
             </w:pPr>
             <w:r>
               <w:rPr>
@@ -1982,7 +1996,7 @@
                 <w:sz w:val="22"/>
                 <w:szCs w:val="22"/>
               </w:rPr>
-              <w:t xml:space="preserve">Disable Swagger after demo, or protect it with admin auth/IP restrictions.</w:t>
+              <w:t xml:space="preserve">Implement the matching messaging APIs or keep the controls disabled/hidden in the public launch build.</w:t>
             </w:r>
           </w:p>
         </w:tc>
@@ -2019,7 +2033,7 @@
               <w:bottom w:val="single" w:color="DADFE7" w:sz="1"/>
               <w:right w:val="single" w:color="DADFE7" w:sz="1"/>
             </w:tcBorders>
-            <w:shd w:fill="FFF4DE"/>
+            <w:shd w:fill="EEF6FF"/>
             <w:tcMar>
               <w:top w:type="dxa" w:w="140"/>
               <w:left w:type="dxa" w:w="160"/>
@@ -2029,7 +2043,7 @@
           </w:tcPr>
           <w:p>
             <w:pPr>
-              <w:spacing w:before="0" w:after="80" w:line="264"/>
+              <w:spacing w:after="80" w:before="0" w:line="264"/>
             </w:pPr>
             <w:r>
               <w:rPr>
@@ -2040,7 +2054,7 @@
                 <w:sz w:val="22"/>
                 <w:szCs w:val="22"/>
               </w:rPr>
-              <w:t xml:space="preserve">SQA-004  High  </w:t>
+              <w:t xml:space="preserve">SQA-004  Medium  </w:t>
             </w:r>
             <w:r>
               <w:rPr>
@@ -2051,12 +2065,12 @@
                 <w:sz w:val="22"/>
                 <w:szCs w:val="22"/>
               </w:rPr>
-              <w:t xml:space="preserve">Bookings: Demo booking accepts incomplete data.</w:t>
-            </w:r>
-          </w:p>
-          <w:p>
-            <w:pPr>
-              <w:spacing w:before="0" w:after="60" w:line="264"/>
+              <w:t xml:space="preserve">Media Reliability: Tutor photos still depend on third-party image URLs.</w:t>
+            </w:r>
+          </w:p>
+          <w:p>
+            <w:pPr>
+              <w:spacing w:after="60" w:before="0" w:line="264"/>
             </w:pPr>
             <w:r>
               <w:rPr>
@@ -2076,12 +2090,12 @@
                 <w:sz w:val="22"/>
                 <w:szCs w:val="22"/>
               </w:rPr>
-              <w:t xml:space="preserve">Student name, parent phone, and learning goal are nullable in backend/data model and frontend required validation is missing.</w:t>
-            </w:r>
-          </w:p>
-          <w:p>
-            <w:pPr>
-              <w:spacing w:before="0" w:after="0" w:line="264"/>
+              <w:t xml:space="preserve">The UI now has avatar fallbacks, but seed data still references external images that can be blocked or rate-limited.</w:t>
+            </w:r>
+          </w:p>
+          <w:p>
+            <w:pPr>
+              <w:spacing w:after="0" w:before="0" w:line="264"/>
             </w:pPr>
             <w:r>
               <w:rPr>
@@ -2101,7 +2115,7 @@
                 <w:sz w:val="22"/>
                 <w:szCs w:val="22"/>
               </w:rPr>
-              <w:t xml:space="preserve">Add frontend validators, backend request validation, and DB constraints where appropriate.</w:t>
+              <w:t xml:space="preserve">Self-host tutor images or serve them through a controlled CDN/proxy before marketing traffic increases.</w:t>
             </w:r>
           </w:p>
         </w:tc>
@@ -2138,7 +2152,7 @@
               <w:bottom w:val="single" w:color="DADFE7" w:sz="1"/>
               <w:right w:val="single" w:color="DADFE7" w:sz="1"/>
             </w:tcBorders>
-            <w:shd w:fill="EEF6FF"/>
+            <w:shd w:fill="F5F7FA"/>
             <w:tcMar>
               <w:top w:type="dxa" w:w="140"/>
               <w:left w:type="dxa" w:w="160"/>
@@ -2148,7 +2162,7 @@
           </w:tcPr>
           <w:p>
             <w:pPr>
-              <w:spacing w:before="0" w:after="80" w:line="264"/>
+              <w:spacing w:after="80" w:before="0" w:line="264"/>
             </w:pPr>
             <w:r>
               <w:rPr>
@@ -2159,7 +2173,7 @@
                 <w:sz w:val="22"/>
                 <w:szCs w:val="22"/>
               </w:rPr>
-              <w:t xml:space="preserve">SQA-005  Medium  </w:t>
+              <w:t xml:space="preserve">SQA-005  Low  </w:t>
             </w:r>
             <w:r>
               <w:rPr>
@@ -2170,12 +2184,12 @@
                 <w:sz w:val="22"/>
                 <w:szCs w:val="22"/>
               </w:rPr>
-              <w:t xml:space="preserve">Authentication UX: Login helper actions look clickable but do nothing.</w:t>
-            </w:r>
-          </w:p>
-          <w:p>
-            <w:pPr>
-              <w:spacing w:before="0" w:after="60" w:line="264"/>
+              <w:t xml:space="preserve">Database Operations: Database migrations are script-driven and not yet part of CI.</w:t>
+            </w:r>
+          </w:p>
+          <w:p>
+            <w:pPr>
+              <w:spacing w:after="60" w:before="0" w:line="264"/>
             </w:pPr>
             <w:r>
               <w:rPr>
@@ -2195,12 +2209,12 @@
                 <w:sz w:val="22"/>
                 <w:szCs w:val="22"/>
               </w:rPr>
-              <w:t xml:space="preserve">Continue with Google and Forgot password stay on the same page and have no working handler.</w:t>
-            </w:r>
-          </w:p>
-          <w:p>
-            <w:pPr>
-              <w:spacing w:before="0" w:after="0" w:line="264"/>
+              <w:t xml:space="preserve">A migration helper now tracks applied SQL files in dbo.schemaMigrations, but the release process still runs it manually.</w:t>
+            </w:r>
+          </w:p>
+          <w:p>
+            <w:pPr>
+              <w:spacing w:after="0" w:before="0" w:line="264"/>
             </w:pPr>
             <w:r>
               <w:rPr>
@@ -2220,7 +2234,7 @@
                 <w:sz w:val="22"/>
                 <w:szCs w:val="22"/>
               </w:rPr>
-              <w:t xml:space="preserve">Implement OAuth/password reset or hide/disable these actions with an honest coming-soon state.</w:t>
+              <w:t xml:space="preserve">Wire the migration helper into a protected deployment workflow once production release automation is introduced.</w:t>
             </w:r>
           </w:p>
         </w:tc>
@@ -2257,7 +2271,7 @@
               <w:bottom w:val="single" w:color="DADFE7" w:sz="1"/>
               <w:right w:val="single" w:color="DADFE7" w:sz="1"/>
             </w:tcBorders>
-            <w:shd w:fill="EEF6FF"/>
+            <w:shd w:fill="F5F7FA"/>
             <w:tcMar>
               <w:top w:type="dxa" w:w="140"/>
               <w:left w:type="dxa" w:w="160"/>
@@ -2267,7 +2281,7 @@
           </w:tcPr>
           <w:p>
             <w:pPr>
-              <w:spacing w:before="0" w:after="80" w:line="264"/>
+              <w:spacing w:after="80" w:before="0" w:line="264"/>
             </w:pPr>
             <w:r>
               <w:rPr>
@@ -2278,7 +2292,7 @@
                 <w:sz w:val="22"/>
                 <w:szCs w:val="22"/>
               </w:rPr>
-              <w:t xml:space="preserve">SQA-006  Medium  </w:t>
+              <w:t xml:space="preserve">SQA-006  Low  </w:t>
             </w:r>
             <w:r>
               <w:rPr>
@@ -2289,12 +2303,12 @@
                 <w:sz w:val="22"/>
                 <w:szCs w:val="22"/>
               </w:rPr>
-              <w:t xml:space="preserve">Saved Tutors: Saved Tutors module has no save action.</w:t>
-            </w:r>
-          </w:p>
-          <w:p>
-            <w:pPr>
-              <w:spacing w:before="0" w:after="60" w:line="264"/>
+              <w:t xml:space="preserve">Backend Test Coverage: No backend test project exists yet.</w:t>
+            </w:r>
+          </w:p>
+          <w:p>
+            <w:pPr>
+              <w:spacing w:after="60" w:before="0" w:line="264"/>
             </w:pPr>
             <w:r>
               <w:rPr>
@@ -2314,12 +2328,12 @@
                 <w:sz w:val="22"/>
                 <w:szCs w:val="22"/>
               </w:rPr>
-              <w:t xml:space="preserve">Saved Tutors page exists, but tutor cards/profile pages do not expose Save or Heart controls.</w:t>
-            </w:r>
-          </w:p>
-          <w:p>
-            <w:pPr>
-              <w:spacing w:before="0" w:after="0" w:line="264"/>
+              <w:t xml:space="preserve">Release builds pass, but backend validation/repository/auth behavior is not locked by automated unit or integration tests.</w:t>
+            </w:r>
+          </w:p>
+          <w:p>
+            <w:pPr>
+              <w:spacing w:after="0" w:before="0" w:line="264"/>
             </w:pPr>
             <w:r>
               <w:rPr>
@@ -2339,7 +2353,7 @@
                 <w:sz w:val="22"/>
                 <w:szCs w:val="22"/>
               </w:rPr>
-              <w:t xml:space="preserve">Add save/unsave on cards and profiles, with signed-out redirect to login.</w:t>
+              <w:t xml:space="preserve">Add xUnit or NUnit coverage for auth, bookings validation, saved tutors, Insight, and API fallback behavior.</w:t>
             </w:r>
           </w:p>
         </w:tc>
@@ -2376,7 +2390,7 @@
               <w:bottom w:val="single" w:color="DADFE7" w:sz="1"/>
               <w:right w:val="single" w:color="DADFE7" w:sz="1"/>
             </w:tcBorders>
-            <w:shd w:fill="EEF6FF"/>
+            <w:shd w:fill="F5F7FA"/>
             <w:tcMar>
               <w:top w:type="dxa" w:w="140"/>
               <w:left w:type="dxa" w:w="160"/>
@@ -2386,7 +2400,7 @@
           </w:tcPr>
           <w:p>
             <w:pPr>
-              <w:spacing w:before="0" w:after="80" w:line="264"/>
+              <w:spacing w:after="80" w:before="0" w:line="264"/>
             </w:pPr>
             <w:r>
               <w:rPr>
@@ -2397,7 +2411,7 @@
                 <w:sz w:val="22"/>
                 <w:szCs w:val="22"/>
               </w:rPr>
-              <w:t xml:space="preserve">SQA-007  Medium  </w:t>
+              <w:t xml:space="preserve">SQA-007  Low  </w:t>
             </w:r>
             <w:r>
               <w:rPr>
@@ -2408,12 +2422,12 @@
                 <w:sz w:val="22"/>
                 <w:szCs w:val="22"/>
               </w:rPr>
-              <w:t xml:space="preserve">Marketplace UX: Empty search state still claims AI recommendations.</w:t>
-            </w:r>
-          </w:p>
-          <w:p>
-            <w:pPr>
-              <w:spacing w:before="0" w:after="60" w:line="264"/>
+              <w:t xml:space="preserve">Accessibility And Performance: Automated a11y and Lighthouse checks are not yet part of CI.</w:t>
+            </w:r>
+          </w:p>
+          <w:p>
+            <w:pPr>
+              <w:spacing w:after="60" w:before="0" w:line="264"/>
             </w:pPr>
             <w:r>
               <w:rPr>
@@ -2433,12 +2447,12 @@
                 <w:sz w:val="22"/>
                 <w:szCs w:val="22"/>
               </w:rPr>
-              <w:t xml:space="preserve">Filtered empty state shows 0 tutors while the UI still says 3 AI-recommended for you.</w:t>
-            </w:r>
-          </w:p>
-          <w:p>
-            <w:pPr>
-              <w:spacing w:before="0" w:after="0" w:line="264"/>
+              <w:t xml:space="preserve">Playwright smoke coverage exists, but axe/Lighthouse/Web Vitals style checks are not automated.</w:t>
+            </w:r>
+          </w:p>
+          <w:p>
+            <w:pPr>
+              <w:spacing w:after="0" w:before="0" w:line="264"/>
             </w:pPr>
             <w:r>
               <w:rPr>
@@ -2458,7 +2472,7 @@
                 <w:sz w:val="22"/>
                 <w:szCs w:val="22"/>
               </w:rPr>
-              <w:t xml:space="preserve">Hide the recommendation badge on empty results or replace it with recovery actions.</w:t>
+              <w:t xml:space="preserve">Add axe-core checks and Lighthouse/Web Vitals budgets after HTTPS is enabled.</w:t>
             </w:r>
           </w:p>
         </w:tc>
@@ -2469,962 +2483,10 @@
         <w:spacing w:after="80"/>
       </w:pPr>
     </w:p>
-    <w:tbl>
-      <w:tblPr>
-        <w:tblW w:type="dxa" w:w="9360"/>
-        <w:tblBorders>
-          <w:top w:val="single" w:color="auto" w:sz="4"/>
-          <w:left w:val="single" w:color="auto" w:sz="4"/>
-          <w:bottom w:val="single" w:color="auto" w:sz="4"/>
-          <w:right w:val="single" w:color="auto" w:sz="4"/>
-          <w:insideH w:val="single" w:color="auto" w:sz="4"/>
-          <w:insideV w:val="single" w:color="auto" w:sz="4"/>
-        </w:tblBorders>
-        <w:tblLayout w:type="fixed"/>
-      </w:tblPr>
-      <w:tblGrid>
-        <w:gridCol w:w="100"/>
-      </w:tblGrid>
-      <w:tr>
-        <w:tc>
-          <w:tcPr>
-            <w:tcW w:type="dxa" w:w="9360"/>
-            <w:tcBorders>
-              <w:top w:val="single" w:color="DADFE7" w:sz="1"/>
-              <w:left w:val="single" w:color="DADFE7" w:sz="1"/>
-              <w:bottom w:val="single" w:color="DADFE7" w:sz="1"/>
-              <w:right w:val="single" w:color="DADFE7" w:sz="1"/>
-            </w:tcBorders>
-            <w:shd w:fill="EEF6FF"/>
-            <w:tcMar>
-              <w:top w:type="dxa" w:w="140"/>
-              <w:left w:type="dxa" w:w="160"/>
-              <w:bottom w:type="dxa" w:w="140"/>
-              <w:right w:type="dxa" w:w="160"/>
-            </w:tcMar>
-          </w:tcPr>
-          <w:p>
-            <w:pPr>
-              <w:spacing w:before="0" w:after="80" w:line="264"/>
-            </w:pPr>
-            <w:r>
-              <w:rPr>
-                <w:rFonts w:ascii="Calibri" w:cs="Calibri" w:eastAsia="Calibri" w:hAnsi="Calibri"/>
-                <w:b/>
-                <w:bCs/>
-                <w:color w:val="1F4D78"/>
-                <w:sz w:val="22"/>
-                <w:szCs w:val="22"/>
-              </w:rPr>
-              <w:t xml:space="preserve">SQA-008  Medium  </w:t>
-            </w:r>
-            <w:r>
-              <w:rPr>
-                <w:rFonts w:ascii="Calibri" w:cs="Calibri" w:eastAsia="Calibri" w:hAnsi="Calibri"/>
-                <w:b/>
-                <w:bCs/>
-                <w:color w:val="0B2545"/>
-                <w:sz w:val="22"/>
-                <w:szCs w:val="22"/>
-              </w:rPr>
-              <w:t xml:space="preserve">Media Reliability: External tutor photos are unreliable.</w:t>
-            </w:r>
-          </w:p>
-          <w:p>
-            <w:pPr>
-              <w:spacing w:before="0" w:after="60" w:line="264"/>
-            </w:pPr>
-            <w:r>
-              <w:rPr>
-                <w:rFonts w:ascii="Calibri" w:cs="Calibri" w:eastAsia="Calibri" w:hAnsi="Calibri"/>
-                <w:b/>
-                <w:bCs/>
-                <w:color w:val="0B2545"/>
-                <w:sz w:val="22"/>
-                <w:szCs w:val="22"/>
-              </w:rPr>
-              <w:t xml:space="preserve">Finding: </w:t>
-            </w:r>
-            <w:r>
-              <w:rPr>
-                <w:rFonts w:ascii="Calibri" w:cs="Calibri" w:eastAsia="Calibri" w:hAnsi="Calibri"/>
-                <w:color w:val="0B2545"/>
-                <w:sz w:val="22"/>
-                <w:szCs w:val="22"/>
-              </w:rPr>
-              <w:t xml:space="preserve">Chromium blocked at least one external Unsplash tutor image with ERR_BLOCKED_BY_ORB.</w:t>
-            </w:r>
-          </w:p>
-          <w:p>
-            <w:pPr>
-              <w:spacing w:before="0" w:after="0" w:line="264"/>
-            </w:pPr>
-            <w:r>
-              <w:rPr>
-                <w:rFonts w:ascii="Calibri" w:cs="Calibri" w:eastAsia="Calibri" w:hAnsi="Calibri"/>
-                <w:b/>
-                <w:bCs/>
-                <w:color w:val="0B2545"/>
-                <w:sz w:val="22"/>
-                <w:szCs w:val="22"/>
-              </w:rPr>
-              <w:t xml:space="preserve">Recommended fix: </w:t>
-            </w:r>
-            <w:r>
-              <w:rPr>
-                <w:rFonts w:ascii="Calibri" w:cs="Calibri" w:eastAsia="Calibri" w:hAnsi="Calibri"/>
-                <w:color w:val="0B2545"/>
-                <w:sz w:val="22"/>
-                <w:szCs w:val="22"/>
-              </w:rPr>
-              <w:t xml:space="preserve">Self-host tutor images or serve them through a controlled CDN/proxy.</w:t>
-            </w:r>
-          </w:p>
-        </w:tc>
-      </w:tr>
-    </w:tbl>
-    <w:p>
-      <w:pPr>
-        <w:spacing w:after="80"/>
-      </w:pPr>
-    </w:p>
-    <w:tbl>
-      <w:tblPr>
-        <w:tblW w:type="dxa" w:w="9360"/>
-        <w:tblBorders>
-          <w:top w:val="single" w:color="auto" w:sz="4"/>
-          <w:left w:val="single" w:color="auto" w:sz="4"/>
-          <w:bottom w:val="single" w:color="auto" w:sz="4"/>
-          <w:right w:val="single" w:color="auto" w:sz="4"/>
-          <w:insideH w:val="single" w:color="auto" w:sz="4"/>
-          <w:insideV w:val="single" w:color="auto" w:sz="4"/>
-        </w:tblBorders>
-        <w:tblLayout w:type="fixed"/>
-      </w:tblPr>
-      <w:tblGrid>
-        <w:gridCol w:w="100"/>
-      </w:tblGrid>
-      <w:tr>
-        <w:tc>
-          <w:tcPr>
-            <w:tcW w:type="dxa" w:w="9360"/>
-            <w:tcBorders>
-              <w:top w:val="single" w:color="DADFE7" w:sz="1"/>
-              <w:left w:val="single" w:color="DADFE7" w:sz="1"/>
-              <w:bottom w:val="single" w:color="DADFE7" w:sz="1"/>
-              <w:right w:val="single" w:color="DADFE7" w:sz="1"/>
-            </w:tcBorders>
-            <w:shd w:fill="EEF6FF"/>
-            <w:tcMar>
-              <w:top w:type="dxa" w:w="140"/>
-              <w:left w:type="dxa" w:w="160"/>
-              <w:bottom w:type="dxa" w:w="140"/>
-              <w:right w:type="dxa" w:w="160"/>
-            </w:tcMar>
-          </w:tcPr>
-          <w:p>
-            <w:pPr>
-              <w:spacing w:before="0" w:after="80" w:line="264"/>
-            </w:pPr>
-            <w:r>
-              <w:rPr>
-                <w:rFonts w:ascii="Calibri" w:cs="Calibri" w:eastAsia="Calibri" w:hAnsi="Calibri"/>
-                <w:b/>
-                <w:bCs/>
-                <w:color w:val="1F4D78"/>
-                <w:sz w:val="22"/>
-                <w:szCs w:val="22"/>
-              </w:rPr>
-              <w:t xml:space="preserve">SQA-009  Medium  </w:t>
-            </w:r>
-            <w:r>
-              <w:rPr>
-                <w:rFonts w:ascii="Calibri" w:cs="Calibri" w:eastAsia="Calibri" w:hAnsi="Calibri"/>
-                <w:b/>
-                <w:bCs/>
-                <w:color w:val="0B2545"/>
-                <w:sz w:val="22"/>
-                <w:szCs w:val="22"/>
-              </w:rPr>
-              <w:t xml:space="preserve">Messages UX: Messages controls are decorative.</w:t>
-            </w:r>
-          </w:p>
-          <w:p>
-            <w:pPr>
-              <w:spacing w:before="0" w:after="60" w:line="264"/>
-            </w:pPr>
-            <w:r>
-              <w:rPr>
-                <w:rFonts w:ascii="Calibri" w:cs="Calibri" w:eastAsia="Calibri" w:hAnsi="Calibri"/>
-                <w:b/>
-                <w:bCs/>
-                <w:color w:val="0B2545"/>
-                <w:sz w:val="22"/>
-                <w:szCs w:val="22"/>
-              </w:rPr>
-              <w:t xml:space="preserve">Finding: </w:t>
-            </w:r>
-            <w:r>
-              <w:rPr>
-                <w:rFonts w:ascii="Calibri" w:cs="Calibri" w:eastAsia="Calibri" w:hAnsi="Calibri"/>
-                <w:color w:val="0B2545"/>
-                <w:sz w:val="22"/>
-                <w:szCs w:val="22"/>
-              </w:rPr>
-              <w:t xml:space="preserve">Search, paperclip, phone, video, and more icons look actionable but are static.</w:t>
-            </w:r>
-          </w:p>
-          <w:p>
-            <w:pPr>
-              <w:spacing w:before="0" w:after="0" w:line="264"/>
-            </w:pPr>
-            <w:r>
-              <w:rPr>
-                <w:rFonts w:ascii="Calibri" w:cs="Calibri" w:eastAsia="Calibri" w:hAnsi="Calibri"/>
-                <w:b/>
-                <w:bCs/>
-                <w:color w:val="0B2545"/>
-                <w:sz w:val="22"/>
-                <w:szCs w:val="22"/>
-              </w:rPr>
-              <w:t xml:space="preserve">Recommended fix: </w:t>
-            </w:r>
-            <w:r>
-              <w:rPr>
-                <w:rFonts w:ascii="Calibri" w:cs="Calibri" w:eastAsia="Calibri" w:hAnsi="Calibri"/>
-                <w:color w:val="0B2545"/>
-                <w:sz w:val="22"/>
-                <w:szCs w:val="22"/>
-              </w:rPr>
-              <w:t xml:space="preserve">Convert them to real buttons with handlers/tooltips or remove them until available.</w:t>
-            </w:r>
-          </w:p>
-        </w:tc>
-      </w:tr>
-    </w:tbl>
-    <w:p>
-      <w:pPr>
-        <w:spacing w:after="80"/>
-      </w:pPr>
-    </w:p>
-    <w:tbl>
-      <w:tblPr>
-        <w:tblW w:type="dxa" w:w="9360"/>
-        <w:tblBorders>
-          <w:top w:val="single" w:color="auto" w:sz="4"/>
-          <w:left w:val="single" w:color="auto" w:sz="4"/>
-          <w:bottom w:val="single" w:color="auto" w:sz="4"/>
-          <w:right w:val="single" w:color="auto" w:sz="4"/>
-          <w:insideH w:val="single" w:color="auto" w:sz="4"/>
-          <w:insideV w:val="single" w:color="auto" w:sz="4"/>
-        </w:tblBorders>
-        <w:tblLayout w:type="fixed"/>
-      </w:tblPr>
-      <w:tblGrid>
-        <w:gridCol w:w="100"/>
-      </w:tblGrid>
-      <w:tr>
-        <w:tc>
-          <w:tcPr>
-            <w:tcW w:type="dxa" w:w="9360"/>
-            <w:tcBorders>
-              <w:top w:val="single" w:color="DADFE7" w:sz="1"/>
-              <w:left w:val="single" w:color="DADFE7" w:sz="1"/>
-              <w:bottom w:val="single" w:color="DADFE7" w:sz="1"/>
-              <w:right w:val="single" w:color="DADFE7" w:sz="1"/>
-            </w:tcBorders>
-            <w:shd w:fill="EEF6FF"/>
-            <w:tcMar>
-              <w:top w:type="dxa" w:w="140"/>
-              <w:left w:type="dxa" w:w="160"/>
-              <w:bottom w:type="dxa" w:w="140"/>
-              <w:right w:type="dxa" w:w="160"/>
-            </w:tcMar>
-          </w:tcPr>
-          <w:p>
-            <w:pPr>
-              <w:spacing w:before="0" w:after="80" w:line="264"/>
-            </w:pPr>
-            <w:r>
-              <w:rPr>
-                <w:rFonts w:ascii="Calibri" w:cs="Calibri" w:eastAsia="Calibri" w:hAnsi="Calibri"/>
-                <w:b/>
-                <w:bCs/>
-                <w:color w:val="1F4D78"/>
-                <w:sz w:val="22"/>
-                <w:szCs w:val="22"/>
-              </w:rPr>
-              <w:t xml:space="preserve">SQA-010  Medium  </w:t>
-            </w:r>
-            <w:r>
-              <w:rPr>
-                <w:rFonts w:ascii="Calibri" w:cs="Calibri" w:eastAsia="Calibri" w:hAnsi="Calibri"/>
-                <w:b/>
-                <w:bCs/>
-                <w:color w:val="0B2545"/>
-                <w:sz w:val="22"/>
-                <w:szCs w:val="22"/>
-              </w:rPr>
-              <w:t xml:space="preserve">Accessibility: Several form controls rely on placeholders.</w:t>
-            </w:r>
-          </w:p>
-          <w:p>
-            <w:pPr>
-              <w:spacing w:before="0" w:after="60" w:line="264"/>
-            </w:pPr>
-            <w:r>
-              <w:rPr>
-                <w:rFonts w:ascii="Calibri" w:cs="Calibri" w:eastAsia="Calibri" w:hAnsi="Calibri"/>
-                <w:b/>
-                <w:bCs/>
-                <w:color w:val="0B2545"/>
-                <w:sz w:val="22"/>
-                <w:szCs w:val="22"/>
-              </w:rPr>
-              <w:t xml:space="preserve">Finding: </w:t>
-            </w:r>
-            <w:r>
-              <w:rPr>
-                <w:rFonts w:ascii="Calibri" w:cs="Calibri" w:eastAsia="Calibri" w:hAnsi="Calibri"/>
-                <w:color w:val="0B2545"/>
-                <w:sz w:val="22"/>
-                <w:szCs w:val="22"/>
-              </w:rPr>
-              <w:t xml:space="preserve">Booking form fields and message input lack durable programmatic labels.</w:t>
-            </w:r>
-          </w:p>
-          <w:p>
-            <w:pPr>
-              <w:spacing w:before="0" w:after="0" w:line="264"/>
-            </w:pPr>
-            <w:r>
-              <w:rPr>
-                <w:rFonts w:ascii="Calibri" w:cs="Calibri" w:eastAsia="Calibri" w:hAnsi="Calibri"/>
-                <w:b/>
-                <w:bCs/>
-                <w:color w:val="0B2545"/>
-                <w:sz w:val="22"/>
-                <w:szCs w:val="22"/>
-              </w:rPr>
-              <w:t xml:space="preserve">Recommended fix: </w:t>
-            </w:r>
-            <w:r>
-              <w:rPr>
-                <w:rFonts w:ascii="Calibri" w:cs="Calibri" w:eastAsia="Calibri" w:hAnsi="Calibri"/>
-                <w:color w:val="0B2545"/>
-                <w:sz w:val="22"/>
-                <w:szCs w:val="22"/>
-              </w:rPr>
-              <w:t xml:space="preserve">Add label, aria-label, or aria-labelledby for every input/control.</w:t>
-            </w:r>
-          </w:p>
-        </w:tc>
-      </w:tr>
-    </w:tbl>
-    <w:p>
-      <w:pPr>
-        <w:spacing w:after="80"/>
-      </w:pPr>
-    </w:p>
-    <w:tbl>
-      <w:tblPr>
-        <w:tblW w:type="dxa" w:w="9360"/>
-        <w:tblBorders>
-          <w:top w:val="single" w:color="auto" w:sz="4"/>
-          <w:left w:val="single" w:color="auto" w:sz="4"/>
-          <w:bottom w:val="single" w:color="auto" w:sz="4"/>
-          <w:right w:val="single" w:color="auto" w:sz="4"/>
-          <w:insideH w:val="single" w:color="auto" w:sz="4"/>
-          <w:insideV w:val="single" w:color="auto" w:sz="4"/>
-        </w:tblBorders>
-        <w:tblLayout w:type="fixed"/>
-      </w:tblPr>
-      <w:tblGrid>
-        <w:gridCol w:w="100"/>
-      </w:tblGrid>
-      <w:tr>
-        <w:tc>
-          <w:tcPr>
-            <w:tcW w:type="dxa" w:w="9360"/>
-            <w:tcBorders>
-              <w:top w:val="single" w:color="DADFE7" w:sz="1"/>
-              <w:left w:val="single" w:color="DADFE7" w:sz="1"/>
-              <w:bottom w:val="single" w:color="DADFE7" w:sz="1"/>
-              <w:right w:val="single" w:color="DADFE7" w:sz="1"/>
-            </w:tcBorders>
-            <w:shd w:fill="EEF6FF"/>
-            <w:tcMar>
-              <w:top w:type="dxa" w:w="140"/>
-              <w:left w:type="dxa" w:w="160"/>
-              <w:bottom w:type="dxa" w:w="140"/>
-              <w:right w:type="dxa" w:w="160"/>
-            </w:tcMar>
-          </w:tcPr>
-          <w:p>
-            <w:pPr>
-              <w:spacing w:before="0" w:after="80" w:line="264"/>
-            </w:pPr>
-            <w:r>
-              <w:rPr>
-                <w:rFonts w:ascii="Calibri" w:cs="Calibri" w:eastAsia="Calibri" w:hAnsi="Calibri"/>
-                <w:b/>
-                <w:bCs/>
-                <w:color w:val="1F4D78"/>
-                <w:sz w:val="22"/>
-                <w:szCs w:val="22"/>
-              </w:rPr>
-              <w:t xml:space="preserve">SQA-011  Medium  </w:t>
-            </w:r>
-            <w:r>
-              <w:rPr>
-                <w:rFonts w:ascii="Calibri" w:cs="Calibri" w:eastAsia="Calibri" w:hAnsi="Calibri"/>
-                <w:b/>
-                <w:bCs/>
-                <w:color w:val="0B2545"/>
-                <w:sz w:val="22"/>
-                <w:szCs w:val="22"/>
-              </w:rPr>
-              <w:t xml:space="preserve">Mobile UX: Some mobile tap targets are below 44 px.</w:t>
-            </w:r>
-          </w:p>
-          <w:p>
-            <w:pPr>
-              <w:spacing w:before="0" w:after="60" w:line="264"/>
-            </w:pPr>
-            <w:r>
-              <w:rPr>
-                <w:rFonts w:ascii="Calibri" w:cs="Calibri" w:eastAsia="Calibri" w:hAnsi="Calibri"/>
-                <w:b/>
-                <w:bCs/>
-                <w:color w:val="0B2545"/>
-                <w:sz w:val="22"/>
-                <w:szCs w:val="22"/>
-              </w:rPr>
-              <w:t xml:space="preserve">Finding: </w:t>
-            </w:r>
-            <w:r>
-              <w:rPr>
-                <w:rFonts w:ascii="Calibri" w:cs="Calibri" w:eastAsia="Calibri" w:hAnsi="Calibri"/>
-                <w:color w:val="0B2545"/>
-                <w:sz w:val="22"/>
-                <w:szCs w:val="22"/>
-              </w:rPr>
-              <w:t xml:space="preserve">Small menu/logout/link-style controls and chips are difficult to tap reliably.</w:t>
-            </w:r>
-          </w:p>
-          <w:p>
-            <w:pPr>
-              <w:spacing w:before="0" w:after="0" w:line="264"/>
-            </w:pPr>
-            <w:r>
-              <w:rPr>
-                <w:rFonts w:ascii="Calibri" w:cs="Calibri" w:eastAsia="Calibri" w:hAnsi="Calibri"/>
-                <w:b/>
-                <w:bCs/>
-                <w:color w:val="0B2545"/>
-                <w:sz w:val="22"/>
-                <w:szCs w:val="22"/>
-              </w:rPr>
-              <w:t xml:space="preserve">Recommended fix: </w:t>
-            </w:r>
-            <w:r>
-              <w:rPr>
-                <w:rFonts w:ascii="Calibri" w:cs="Calibri" w:eastAsia="Calibri" w:hAnsi="Calibri"/>
-                <w:color w:val="0B2545"/>
-                <w:sz w:val="22"/>
-                <w:szCs w:val="22"/>
-              </w:rPr>
-              <w:t xml:space="preserve">Increase hit areas with min-height/padding without making the UI visually bulky.</w:t>
-            </w:r>
-          </w:p>
-        </w:tc>
-      </w:tr>
-    </w:tbl>
-    <w:p>
-      <w:pPr>
-        <w:spacing w:after="80"/>
-      </w:pPr>
-    </w:p>
-    <w:tbl>
-      <w:tblPr>
-        <w:tblW w:type="dxa" w:w="9360"/>
-        <w:tblBorders>
-          <w:top w:val="single" w:color="auto" w:sz="4"/>
-          <w:left w:val="single" w:color="auto" w:sz="4"/>
-          <w:bottom w:val="single" w:color="auto" w:sz="4"/>
-          <w:right w:val="single" w:color="auto" w:sz="4"/>
-          <w:insideH w:val="single" w:color="auto" w:sz="4"/>
-          <w:insideV w:val="single" w:color="auto" w:sz="4"/>
-        </w:tblBorders>
-        <w:tblLayout w:type="fixed"/>
-      </w:tblPr>
-      <w:tblGrid>
-        <w:gridCol w:w="100"/>
-      </w:tblGrid>
-      <w:tr>
-        <w:tc>
-          <w:tcPr>
-            <w:tcW w:type="dxa" w:w="9360"/>
-            <w:tcBorders>
-              <w:top w:val="single" w:color="DADFE7" w:sz="1"/>
-              <w:left w:val="single" w:color="DADFE7" w:sz="1"/>
-              <w:bottom w:val="single" w:color="DADFE7" w:sz="1"/>
-              <w:right w:val="single" w:color="DADFE7" w:sz="1"/>
-            </w:tcBorders>
-            <w:shd w:fill="F5F7FA"/>
-            <w:tcMar>
-              <w:top w:type="dxa" w:w="140"/>
-              <w:left w:type="dxa" w:w="160"/>
-              <w:bottom w:type="dxa" w:w="140"/>
-              <w:right w:type="dxa" w:w="160"/>
-            </w:tcMar>
-          </w:tcPr>
-          <w:p>
-            <w:pPr>
-              <w:spacing w:before="0" w:after="80" w:line="264"/>
-            </w:pPr>
-            <w:r>
-              <w:rPr>
-                <w:rFonts w:ascii="Calibri" w:cs="Calibri" w:eastAsia="Calibri" w:hAnsi="Calibri"/>
-                <w:b/>
-                <w:bCs/>
-                <w:color w:val="1F4D78"/>
-                <w:sz w:val="22"/>
-                <w:szCs w:val="22"/>
-              </w:rPr>
-              <w:t xml:space="preserve">SQA-012  Low  </w:t>
-            </w:r>
-            <w:r>
-              <w:rPr>
-                <w:rFonts w:ascii="Calibri" w:cs="Calibri" w:eastAsia="Calibri" w:hAnsi="Calibri"/>
-                <w:b/>
-                <w:bCs/>
-                <w:color w:val="0B2545"/>
-                <w:sz w:val="22"/>
-                <w:szCs w:val="22"/>
-              </w:rPr>
-              <w:t xml:space="preserve">Routing UX: Unknown web routes have no proper 404 state.</w:t>
-            </w:r>
-          </w:p>
-          <w:p>
-            <w:pPr>
-              <w:spacing w:before="0" w:after="60" w:line="264"/>
-            </w:pPr>
-            <w:r>
-              <w:rPr>
-                <w:rFonts w:ascii="Calibri" w:cs="Calibri" w:eastAsia="Calibri" w:hAnsi="Calibri"/>
-                <w:b/>
-                <w:bCs/>
-                <w:color w:val="0B2545"/>
-                <w:sz w:val="22"/>
-                <w:szCs w:val="22"/>
-              </w:rPr>
-              <w:t xml:space="preserve">Finding: </w:t>
-            </w:r>
-            <w:r>
-              <w:rPr>
-                <w:rFonts w:ascii="Calibri" w:cs="Calibri" w:eastAsia="Calibri" w:hAnsi="Calibri"/>
-                <w:color w:val="0B2545"/>
-                <w:sz w:val="22"/>
-                <w:szCs w:val="22"/>
-              </w:rPr>
-              <w:t xml:space="preserve">Invalid website routes render/redirect to the Angular shell/home with HTTP 200.</w:t>
-            </w:r>
-          </w:p>
-          <w:p>
-            <w:pPr>
-              <w:spacing w:before="0" w:after="0" w:line="264"/>
-            </w:pPr>
-            <w:r>
-              <w:rPr>
-                <w:rFonts w:ascii="Calibri" w:cs="Calibri" w:eastAsia="Calibri" w:hAnsi="Calibri"/>
-                <w:b/>
-                <w:bCs/>
-                <w:color w:val="0B2545"/>
-                <w:sz w:val="22"/>
-                <w:szCs w:val="22"/>
-              </w:rPr>
-              <w:t xml:space="preserve">Recommended fix: </w:t>
-            </w:r>
-            <w:r>
-              <w:rPr>
-                <w:rFonts w:ascii="Calibri" w:cs="Calibri" w:eastAsia="Calibri" w:hAnsi="Calibri"/>
-                <w:color w:val="0B2545"/>
-                <w:sz w:val="22"/>
-                <w:szCs w:val="22"/>
-              </w:rPr>
-              <w:t xml:space="preserve">Add a not-found route with helpful recovery links.</w:t>
-            </w:r>
-          </w:p>
-        </w:tc>
-      </w:tr>
-    </w:tbl>
-    <w:p>
-      <w:pPr>
-        <w:spacing w:after="80"/>
-      </w:pPr>
-    </w:p>
-    <w:tbl>
-      <w:tblPr>
-        <w:tblW w:type="dxa" w:w="9360"/>
-        <w:tblBorders>
-          <w:top w:val="single" w:color="auto" w:sz="4"/>
-          <w:left w:val="single" w:color="auto" w:sz="4"/>
-          <w:bottom w:val="single" w:color="auto" w:sz="4"/>
-          <w:right w:val="single" w:color="auto" w:sz="4"/>
-          <w:insideH w:val="single" w:color="auto" w:sz="4"/>
-          <w:insideV w:val="single" w:color="auto" w:sz="4"/>
-        </w:tblBorders>
-        <w:tblLayout w:type="fixed"/>
-      </w:tblPr>
-      <w:tblGrid>
-        <w:gridCol w:w="100"/>
-      </w:tblGrid>
-      <w:tr>
-        <w:tc>
-          <w:tcPr>
-            <w:tcW w:type="dxa" w:w="9360"/>
-            <w:tcBorders>
-              <w:top w:val="single" w:color="DADFE7" w:sz="1"/>
-              <w:left w:val="single" w:color="DADFE7" w:sz="1"/>
-              <w:bottom w:val="single" w:color="DADFE7" w:sz="1"/>
-              <w:right w:val="single" w:color="DADFE7" w:sz="1"/>
-            </w:tcBorders>
-            <w:shd w:fill="F5F7FA"/>
-            <w:tcMar>
-              <w:top w:type="dxa" w:w="140"/>
-              <w:left w:type="dxa" w:w="160"/>
-              <w:bottom w:type="dxa" w:w="140"/>
-              <w:right w:type="dxa" w:w="160"/>
-            </w:tcMar>
-          </w:tcPr>
-          <w:p>
-            <w:pPr>
-              <w:spacing w:before="0" w:after="80" w:line="264"/>
-            </w:pPr>
-            <w:r>
-              <w:rPr>
-                <w:rFonts w:ascii="Calibri" w:cs="Calibri" w:eastAsia="Calibri" w:hAnsi="Calibri"/>
-                <w:b/>
-                <w:bCs/>
-                <w:color w:val="1F4D78"/>
-                <w:sz w:val="22"/>
-                <w:szCs w:val="22"/>
-              </w:rPr>
-              <w:t xml:space="preserve">SQA-013  Low  </w:t>
-            </w:r>
-            <w:r>
-              <w:rPr>
-                <w:rFonts w:ascii="Calibri" w:cs="Calibri" w:eastAsia="Calibri" w:hAnsi="Calibri"/>
-                <w:b/>
-                <w:bCs/>
-                <w:color w:val="0B2545"/>
-                <w:sz w:val="22"/>
-                <w:szCs w:val="22"/>
-              </w:rPr>
-              <w:t xml:space="preserve">Test Infrastructure: npm test is configured but broken.</w:t>
-            </w:r>
-          </w:p>
-          <w:p>
-            <w:pPr>
-              <w:spacing w:before="0" w:after="60" w:line="264"/>
-            </w:pPr>
-            <w:r>
-              <w:rPr>
-                <w:rFonts w:ascii="Calibri" w:cs="Calibri" w:eastAsia="Calibri" w:hAnsi="Calibri"/>
-                <w:b/>
-                <w:bCs/>
-                <w:color w:val="0B2545"/>
-                <w:sz w:val="22"/>
-                <w:szCs w:val="22"/>
-              </w:rPr>
-              <w:t xml:space="preserve">Finding: </w:t>
-            </w:r>
-            <w:r>
-              <w:rPr>
-                <w:rFonts w:ascii="Calibri" w:cs="Calibri" w:eastAsia="Calibri" w:hAnsi="Calibri"/>
-                <w:color w:val="0B2545"/>
-                <w:sz w:val="22"/>
-                <w:szCs w:val="22"/>
-              </w:rPr>
-              <w:t xml:space="preserve">angular.json has no test target, so npm test cannot determine what to run.</w:t>
-            </w:r>
-          </w:p>
-          <w:p>
-            <w:pPr>
-              <w:spacing w:before="0" w:after="0" w:line="264"/>
-            </w:pPr>
-            <w:r>
-              <w:rPr>
-                <w:rFonts w:ascii="Calibri" w:cs="Calibri" w:eastAsia="Calibri" w:hAnsi="Calibri"/>
-                <w:b/>
-                <w:bCs/>
-                <w:color w:val="0B2545"/>
-                <w:sz w:val="22"/>
-                <w:szCs w:val="22"/>
-              </w:rPr>
-              <w:t xml:space="preserve">Recommended fix: </w:t>
-            </w:r>
-            <w:r>
-              <w:rPr>
-                <w:rFonts w:ascii="Calibri" w:cs="Calibri" w:eastAsia="Calibri" w:hAnsi="Calibri"/>
-                <w:color w:val="0B2545"/>
-                <w:sz w:val="22"/>
-                <w:szCs w:val="22"/>
-              </w:rPr>
-              <w:t xml:space="preserve">Add Vitest/Karma or replace the script with a real test command.</w:t>
-            </w:r>
-          </w:p>
-        </w:tc>
-      </w:tr>
-    </w:tbl>
-    <w:p>
-      <w:pPr>
-        <w:spacing w:after="80"/>
-      </w:pPr>
-    </w:p>
-    <w:tbl>
-      <w:tblPr>
-        <w:tblW w:type="dxa" w:w="9360"/>
-        <w:tblBorders>
-          <w:top w:val="single" w:color="auto" w:sz="4"/>
-          <w:left w:val="single" w:color="auto" w:sz="4"/>
-          <w:bottom w:val="single" w:color="auto" w:sz="4"/>
-          <w:right w:val="single" w:color="auto" w:sz="4"/>
-          <w:insideH w:val="single" w:color="auto" w:sz="4"/>
-          <w:insideV w:val="single" w:color="auto" w:sz="4"/>
-        </w:tblBorders>
-        <w:tblLayout w:type="fixed"/>
-      </w:tblPr>
-      <w:tblGrid>
-        <w:gridCol w:w="100"/>
-      </w:tblGrid>
-      <w:tr>
-        <w:tc>
-          <w:tcPr>
-            <w:tcW w:type="dxa" w:w="9360"/>
-            <w:tcBorders>
-              <w:top w:val="single" w:color="DADFE7" w:sz="1"/>
-              <w:left w:val="single" w:color="DADFE7" w:sz="1"/>
-              <w:bottom w:val="single" w:color="DADFE7" w:sz="1"/>
-              <w:right w:val="single" w:color="DADFE7" w:sz="1"/>
-            </w:tcBorders>
-            <w:shd w:fill="F5F7FA"/>
-            <w:tcMar>
-              <w:top w:type="dxa" w:w="140"/>
-              <w:left w:type="dxa" w:w="160"/>
-              <w:bottom w:type="dxa" w:w="140"/>
-              <w:right w:type="dxa" w:w="160"/>
-            </w:tcMar>
-          </w:tcPr>
-          <w:p>
-            <w:pPr>
-              <w:spacing w:before="0" w:after="80" w:line="264"/>
-            </w:pPr>
-            <w:r>
-              <w:rPr>
-                <w:rFonts w:ascii="Calibri" w:cs="Calibri" w:eastAsia="Calibri" w:hAnsi="Calibri"/>
-                <w:b/>
-                <w:bCs/>
-                <w:color w:val="1F4D78"/>
-                <w:sz w:val="22"/>
-                <w:szCs w:val="22"/>
-              </w:rPr>
-              <w:t xml:space="preserve">SQA-014  Low  </w:t>
-            </w:r>
-            <w:r>
-              <w:rPr>
-                <w:rFonts w:ascii="Calibri" w:cs="Calibri" w:eastAsia="Calibri" w:hAnsi="Calibri"/>
-                <w:b/>
-                <w:bCs/>
-                <w:color w:val="0B2545"/>
-                <w:sz w:val="22"/>
-                <w:szCs w:val="22"/>
-              </w:rPr>
-              <w:t xml:space="preserve">Performance: Angular initial bundle exceeds warning budget.</w:t>
-            </w:r>
-          </w:p>
-          <w:p>
-            <w:pPr>
-              <w:spacing w:before="0" w:after="60" w:line="264"/>
-            </w:pPr>
-            <w:r>
-              <w:rPr>
-                <w:rFonts w:ascii="Calibri" w:cs="Calibri" w:eastAsia="Calibri" w:hAnsi="Calibri"/>
-                <w:b/>
-                <w:bCs/>
-                <w:color w:val="0B2545"/>
-                <w:sz w:val="22"/>
-                <w:szCs w:val="22"/>
-              </w:rPr>
-              <w:t xml:space="preserve">Finding: </w:t>
-            </w:r>
-            <w:r>
-              <w:rPr>
-                <w:rFonts w:ascii="Calibri" w:cs="Calibri" w:eastAsia="Calibri" w:hAnsi="Calibri"/>
-                <w:color w:val="0B2545"/>
-                <w:sz w:val="22"/>
-                <w:szCs w:val="22"/>
-              </w:rPr>
-              <w:t xml:space="preserve">Build succeeds, but initial bundle is 616.68 kB against a 500 kB warning budget.</w:t>
-            </w:r>
-          </w:p>
-          <w:p>
-            <w:pPr>
-              <w:spacing w:before="0" w:after="0" w:line="264"/>
-            </w:pPr>
-            <w:r>
-              <w:rPr>
-                <w:rFonts w:ascii="Calibri" w:cs="Calibri" w:eastAsia="Calibri" w:hAnsi="Calibri"/>
-                <w:b/>
-                <w:bCs/>
-                <w:color w:val="0B2545"/>
-                <w:sz w:val="22"/>
-                <w:szCs w:val="22"/>
-              </w:rPr>
-              <w:t xml:space="preserve">Recommended fix: </w:t>
-            </w:r>
-            <w:r>
-              <w:rPr>
-                <w:rFonts w:ascii="Calibri" w:cs="Calibri" w:eastAsia="Calibri" w:hAnsi="Calibri"/>
-                <w:color w:val="0B2545"/>
-                <w:sz w:val="22"/>
-                <w:szCs w:val="22"/>
-              </w:rPr>
-              <w:t xml:space="preserve">Lazy-load feature routes and trim dependencies before scaling the product.</w:t>
-            </w:r>
-          </w:p>
-        </w:tc>
-      </w:tr>
-    </w:tbl>
-    <w:p>
-      <w:pPr>
-        <w:spacing w:after="80"/>
-      </w:pPr>
-    </w:p>
-    <w:tbl>
-      <w:tblPr>
-        <w:tblW w:type="dxa" w:w="9360"/>
-        <w:tblBorders>
-          <w:top w:val="single" w:color="auto" w:sz="4"/>
-          <w:left w:val="single" w:color="auto" w:sz="4"/>
-          <w:bottom w:val="single" w:color="auto" w:sz="4"/>
-          <w:right w:val="single" w:color="auto" w:sz="4"/>
-          <w:insideH w:val="single" w:color="auto" w:sz="4"/>
-          <w:insideV w:val="single" w:color="auto" w:sz="4"/>
-        </w:tblBorders>
-        <w:tblLayout w:type="fixed"/>
-      </w:tblPr>
-      <w:tblGrid>
-        <w:gridCol w:w="100"/>
-      </w:tblGrid>
-      <w:tr>
-        <w:tc>
-          <w:tcPr>
-            <w:tcW w:type="dxa" w:w="9360"/>
-            <w:tcBorders>
-              <w:top w:val="single" w:color="DADFE7" w:sz="1"/>
-              <w:left w:val="single" w:color="DADFE7" w:sz="1"/>
-              <w:bottom w:val="single" w:color="DADFE7" w:sz="1"/>
-              <w:right w:val="single" w:color="DADFE7" w:sz="1"/>
-            </w:tcBorders>
-            <w:shd w:fill="F5F7FA"/>
-            <w:tcMar>
-              <w:top w:type="dxa" w:w="140"/>
-              <w:left w:type="dxa" w:w="160"/>
-              <w:bottom w:type="dxa" w:w="140"/>
-              <w:right w:type="dxa" w:w="160"/>
-            </w:tcMar>
-          </w:tcPr>
-          <w:p>
-            <w:pPr>
-              <w:spacing w:before="0" w:after="80" w:line="264"/>
-            </w:pPr>
-            <w:r>
-              <w:rPr>
-                <w:rFonts w:ascii="Calibri" w:cs="Calibri" w:eastAsia="Calibri" w:hAnsi="Calibri"/>
-                <w:b/>
-                <w:bCs/>
-                <w:color w:val="1F4D78"/>
-                <w:sz w:val="22"/>
-                <w:szCs w:val="22"/>
-              </w:rPr>
-              <w:t xml:space="preserve">SQA-015  Low  </w:t>
-            </w:r>
-            <w:r>
-              <w:rPr>
-                <w:rFonts w:ascii="Calibri" w:cs="Calibri" w:eastAsia="Calibri" w:hAnsi="Calibri"/>
-                <w:b/>
-                <w:bCs/>
-                <w:color w:val="0B2545"/>
-                <w:sz w:val="22"/>
-                <w:szCs w:val="22"/>
-              </w:rPr>
-              <w:t xml:space="preserve">Dev Workflow: Debug build can fail while the local API is running.</w:t>
-            </w:r>
-          </w:p>
-          <w:p>
-            <w:pPr>
-              <w:spacing w:before="0" w:after="60" w:line="264"/>
-            </w:pPr>
-            <w:r>
-              <w:rPr>
-                <w:rFonts w:ascii="Calibri" w:cs="Calibri" w:eastAsia="Calibri" w:hAnsi="Calibri"/>
-                <w:b/>
-                <w:bCs/>
-                <w:color w:val="0B2545"/>
-                <w:sz w:val="22"/>
-                <w:szCs w:val="22"/>
-              </w:rPr>
-              <w:t xml:space="preserve">Finding: </w:t>
-            </w:r>
-            <w:r>
-              <w:rPr>
-                <w:rFonts w:ascii="Calibri" w:cs="Calibri" w:eastAsia="Calibri" w:hAnsi="Calibri"/>
-                <w:color w:val="0B2545"/>
-                <w:sz w:val="22"/>
-                <w:szCs w:val="22"/>
-              </w:rPr>
-              <w:t xml:space="preserve">Tutorly.Api.exe locks Debug output if the local dev server is still active.</w:t>
-            </w:r>
-          </w:p>
-          <w:p>
-            <w:pPr>
-              <w:spacing w:before="0" w:after="0" w:line="264"/>
-            </w:pPr>
-            <w:r>
-              <w:rPr>
-                <w:rFonts w:ascii="Calibri" w:cs="Calibri" w:eastAsia="Calibri" w:hAnsi="Calibri"/>
-                <w:b/>
-                <w:bCs/>
-                <w:color w:val="0B2545"/>
-                <w:sz w:val="22"/>
-                <w:szCs w:val="22"/>
-              </w:rPr>
-              <w:t xml:space="preserve">Recommended fix: </w:t>
-            </w:r>
-            <w:r>
-              <w:rPr>
-                <w:rFonts w:ascii="Calibri" w:cs="Calibri" w:eastAsia="Calibri" w:hAnsi="Calibri"/>
-                <w:color w:val="0B2545"/>
-                <w:sz w:val="22"/>
-                <w:szCs w:val="22"/>
-              </w:rPr>
-              <w:t xml:space="preserve">Stop the dev server before Debug builds or use Release for CI/publish workflows.</w:t>
-            </w:r>
-          </w:p>
-        </w:tc>
-      </w:tr>
-    </w:tbl>
-    <w:p>
-      <w:pPr>
-        <w:spacing w:after="80"/>
-      </w:pPr>
-    </w:p>
     <w:p>
       <w:pPr>
         <w:pStyle w:val="Heading1"/>
-        <w:spacing w:before="320" w:after="160"/>
+        <w:spacing w:after="160" w:before="320"/>
       </w:pPr>
       <w:r>
         <w:t xml:space="preserve">UI / Premium Polish Recommendations</w:t>
@@ -3465,7 +2527,7 @@
           <w:sz w:val="22"/>
           <w:szCs w:val="22"/>
         </w:rPr>
-        <w:t xml:space="preserve">Make every visible control honest: if it looks clickable, it needs hover/focus/active states and a real action.</w:t>
+        <w:t xml:space="preserve">Keep disabled controls visibly disabled with tooltips until the backend feature exists.</w:t>
       </w:r>
     </w:p>
     <w:p>
@@ -3484,7 +2546,7 @@
           <w:sz w:val="22"/>
           <w:szCs w:val="22"/>
         </w:rPr>
-        <w:t xml:space="preserve">Add a proper mobile menu drawer behind the hamburger so navigation feels complete.</w:t>
+        <w:t xml:space="preserve">Continue verifying every dropdown/select on desktop and mobile after each UI change.</w:t>
       </w:r>
     </w:p>
     <w:p>
@@ -3503,7 +2565,7 @@
           <w:sz w:val="22"/>
           <w:szCs w:val="22"/>
         </w:rPr>
-        <w:t xml:space="preserve">Improve marketplace empty states with clear filters, popular tutors, or suggested subjects.</w:t>
+        <w:t xml:space="preserve">Use owned image assets for tutors instead of remote stock URLs.</w:t>
       </w:r>
     </w:p>
     <w:p>
@@ -3527,27 +2589,8 @@
     </w:p>
     <w:p>
       <w:pPr>
-        <w:pStyle w:val="ListParagraph"/>
-        <w:numPr>
-          <w:ilvl w:val="0"/>
-          <w:numId w:val="1"/>
-        </w:numPr>
-        <w:spacing w:after="120" w:line="280"/>
-      </w:pPr>
-      <w:r>
-        <w:rPr>
-          <w:rFonts w:ascii="Calibri" w:cs="Calibri" w:eastAsia="Calibri" w:hAnsi="Calibri"/>
-          <w:color w:val="0B2545"/>
-          <w:sz w:val="22"/>
-          <w:szCs w:val="22"/>
-        </w:rPr>
-        <w:t xml:space="preserve">Use owned image assets for tutors instead of remote stock URLs.</w:t>
-      </w:r>
-    </w:p>
-    <w:p>
-      <w:pPr>
         <w:pStyle w:val="Heading1"/>
-        <w:spacing w:before="320" w:after="160"/>
+        <w:spacing w:after="160" w:before="320"/>
       </w:pPr>
       <w:r>
         <w:t xml:space="preserve">Recommended Next Sprint Order</w:t>
@@ -3741,7 +2784,7 @@
                 <w:sz w:val="19"/>
                 <w:szCs w:val="19"/>
               </w:rPr>
-              <w:t xml:space="preserve">Enable HTTPS and decide Swagger exposure policy.</w:t>
+              <w:t xml:space="preserve">Enable HTTPS/SSL for the production domain.</w:t>
             </w:r>
           </w:p>
         </w:tc>
@@ -3842,7 +2885,7 @@
                 <w:sz w:val="19"/>
                 <w:szCs w:val="19"/>
               </w:rPr>
-              <w:t xml:space="preserve">Fix API 404 fallback and add a real web 404 page.</w:t>
+              <w:t xml:space="preserve">Move the migration helper into protected release automation.</w:t>
             </w:r>
           </w:p>
         </w:tc>
@@ -3875,7 +2918,7 @@
                 <w:sz w:val="19"/>
                 <w:szCs w:val="19"/>
               </w:rPr>
-              <w:t xml:space="preserve">Prevents confusing client behavior.</w:t>
+              <w:t xml:space="preserve">Protects production deploys as schema evolves.</w:t>
             </w:r>
           </w:p>
         </w:tc>
@@ -3943,7 +2986,7 @@
                 <w:sz w:val="19"/>
                 <w:szCs w:val="19"/>
               </w:rPr>
-              <w:t xml:space="preserve">Complete auth utility actions.</w:t>
+              <w:t xml:space="preserve">Implement password reset and Google sign-in.</w:t>
             </w:r>
           </w:p>
         </w:tc>
@@ -3976,7 +3019,7 @@
                 <w:sz w:val="19"/>
                 <w:szCs w:val="19"/>
               </w:rPr>
-              <w:t xml:space="preserve">Visible dead controls hurt trust.</w:t>
+              <w:t xml:space="preserve">Completes account recovery and social auth expectations.</w:t>
             </w:r>
           </w:p>
         </w:tc>
@@ -4044,7 +3087,7 @@
                 <w:sz w:val="19"/>
                 <w:szCs w:val="19"/>
               </w:rPr>
-              <w:t xml:space="preserve">Add booking validation and labels.</w:t>
+              <w:t xml:space="preserve">Implement or hide advanced message controls.</w:t>
             </w:r>
           </w:p>
         </w:tc>
@@ -4077,7 +3120,7 @@
                 <w:sz w:val="19"/>
                 <w:szCs w:val="19"/>
               </w:rPr>
-              <w:t xml:space="preserve">Protects data quality and accessibility.</w:t>
+              <w:t xml:space="preserve">Keeps the experience honest and complete.</w:t>
             </w:r>
           </w:p>
         </w:tc>
@@ -4145,7 +3188,7 @@
                 <w:sz w:val="19"/>
                 <w:szCs w:val="19"/>
               </w:rPr>
-              <w:t xml:space="preserve">Implement save/unsave tutor flow.</w:t>
+              <w:t xml:space="preserve">Self-host tutor media assets.</w:t>
             </w:r>
           </w:p>
         </w:tc>
@@ -4178,7 +3221,7 @@
                 <w:sz w:val="19"/>
                 <w:szCs w:val="19"/>
               </w:rPr>
-              <w:t xml:space="preserve">Completes an existing module.</w:t>
+              <w:t xml:space="preserve">Improves reliability and brand control.</w:t>
             </w:r>
           </w:p>
         </w:tc>
@@ -4246,7 +3289,7 @@
                 <w:sz w:val="19"/>
                 <w:szCs w:val="19"/>
               </w:rPr>
-              <w:t xml:space="preserve">Wire or remove placeholder message controls.</w:t>
+              <w:t xml:space="preserve">Add backend automated tests.</w:t>
             </w:r>
           </w:p>
         </w:tc>
@@ -4279,7 +3322,7 @@
                 <w:sz w:val="19"/>
                 <w:szCs w:val="19"/>
               </w:rPr>
-              <w:t xml:space="preserve">Reduces confusion in a key feature.</w:t>
+              <w:t xml:space="preserve">Locks API behavior before more feature work.</w:t>
             </w:r>
           </w:p>
         </w:tc>
@@ -4347,7 +3390,7 @@
                 <w:sz w:val="19"/>
                 <w:szCs w:val="19"/>
               </w:rPr>
-              <w:t xml:space="preserve">Add frontend and backend regression tests.</w:t>
+              <w:t xml:space="preserve">Add axe/Lighthouse checks.</w:t>
             </w:r>
           </w:p>
         </w:tc>
@@ -4380,7 +3423,7 @@
                 <w:sz w:val="19"/>
                 <w:szCs w:val="19"/>
               </w:rPr>
-              <w:t xml:space="preserve">Locks quality before more feature work.</w:t>
+              <w:t xml:space="preserve">Raises accessibility and performance confidence.</w:t>
             </w:r>
           </w:p>
         </w:tc>
@@ -4448,7 +3491,7 @@
                 <w:sz w:val="19"/>
                 <w:szCs w:val="19"/>
               </w:rPr>
-              <w:t xml:space="preserve">Performance pass and route lazy loading.</w:t>
+              <w:t xml:space="preserve">Expand admin/reporting modules.</w:t>
             </w:r>
           </w:p>
         </w:tc>
@@ -4481,7 +3524,7 @@
                 <w:sz w:val="19"/>
                 <w:szCs w:val="19"/>
               </w:rPr>
-              <w:t xml:space="preserve">Keeps the premium UI fast on mobile.</w:t>
+              <w:t xml:space="preserve">Useful after the learner/tutor flows stabilize.</w:t>
             </w:r>
           </w:p>
         </w:tc>
@@ -4495,7 +3538,7 @@
     <w:p>
       <w:pPr>
         <w:pStyle w:val="Heading1"/>
-        <w:spacing w:before="320" w:after="160"/>
+        <w:spacing w:after="160" w:before="320"/>
       </w:pPr>
       <w:r>
         <w:t xml:space="preserve">Test Coverage Gaps</w:t>
@@ -4599,7 +3642,7 @@
     <w:p>
       <w:pPr>
         <w:pStyle w:val="Heading1"/>
-        <w:spacing w:before="320" w:after="160"/>
+        <w:spacing w:after="160" w:before="320"/>
       </w:pPr>
       <w:r>
         <w:t xml:space="preserve">Evidence Artifact Paths</w:t>
@@ -4607,7 +3650,7 @@
     </w:p>
     <w:p>
       <w:pPr>
-        <w:spacing w:before="0" w:after="120" w:line="264"/>
+        <w:spacing w:after="120" w:before="0" w:line="264"/>
       </w:pPr>
       <w:r>
         <w:rPr>
@@ -4621,7 +3664,7 @@
     </w:p>
     <w:p>
       <w:pPr>
-        <w:spacing w:before="0" w:after="120" w:line="264"/>
+        <w:spacing w:after="120" w:before="0" w:line="264"/>
       </w:pPr>
       <w:r>
         <w:rPr>
@@ -4635,7 +3678,7 @@
     </w:p>
     <w:p>
       <w:pPr>
-        <w:spacing w:before="0" w:after="120" w:line="264"/>
+        <w:spacing w:after="120" w:before="0" w:line="264"/>
       </w:pPr>
       <w:r>
         <w:rPr>
@@ -4648,7 +3691,7 @@
       </w:r>
     </w:p>
     <w:sectPr>
-      <w:footerReference w:type="default" r:id="rId6"/>
+      <w:footerReference w:type="default" r:id="rId7"/>
       <w:pgSz w:w="12240" w:h="15840" w:orient="portrait"/>
       <w:pgMar w:top="1440" w:right="1440" w:bottom="1440" w:left="1440" w:header="708" w:footer="708" w:gutter="0"/>
       <w:pgNumType/>
@@ -4660,6 +3703,43 @@
 
 <file path=word/comments.xml><?xml version="1.0" encoding="utf-8"?>
 <w:comments xmlns:cx="http://schemas.microsoft.com/office/drawing/2014/chartex" xmlns:cx1="http://schemas.microsoft.com/office/drawing/2015/9/8/chartex" xmlns:cx2="http://schemas.microsoft.com/office/drawing/2015/10/21/chartex" xmlns:cx3="http://schemas.microsoft.com/office/drawing/2016/5/9/chartex" xmlns:cx4="http://schemas.microsoft.com/office/drawing/2016/5/10/chartex" xmlns:cx5="http://schemas.microsoft.com/office/drawing/2016/5/11/chartex" xmlns:cx6="http://schemas.microsoft.com/office/drawing/2016/5/12/chartex" xmlns:cx7="http://schemas.microsoft.com/office/drawing/2016/5/13/chartex" xmlns:cx8="http://schemas.microsoft.com/office/drawing/2016/5/14/chartex" xmlns:mc="http://schemas.openxmlformats.org/markup-compatibility/2006" xmlns:aink="http://schemas.microsoft.com/office/drawing/2016/ink" xmlns:am3d="http://schemas.microsoft.com/office/drawing/2017/model3d" xmlns:o="urn:schemas-microsoft-com:office:office" xmlns:r="http://schemas.openxmlformats.org/officeDocument/2006/relationships" xmlns:m="http://schemas.openxmlformats.org/officeDocument/2006/math" xmlns:v="urn:schemas-microsoft-com:vml" xmlns:wp14="http://schemas.microsoft.com/office/word/2010/wordprocessingDrawing" xmlns:wp="http://schemas.openxmlformats.org/drawingml/2006/wordprocessingDrawing" xmlns:w10="urn:schemas-microsoft-com:office:word" xmlns:w="http://schemas.openxmlformats.org/wordprocessingml/2006/main" xmlns:w14="http://schemas.microsoft.com/office/word/2010/wordml" xmlns:w15="http://schemas.microsoft.com/office/word/2012/wordml" xmlns:w16cex="http://schemas.microsoft.com/office/word/2018/wordml/cex" xmlns:w16cid="http://schemas.microsoft.com/office/word/2016/wordml/cid" xmlns:w16="http://schemas.microsoft.com/office/word/2018/wordml" xmlns:w16sdtdh="http://schemas.microsoft.com/office/word/2020/wordml/sdtdatahash" xmlns:w16se="http://schemas.microsoft.com/office/word/2015/wordml/symex" xmlns:wpg="http://schemas.microsoft.com/office/word/2010/wordprocessingGroup" xmlns:wpi="http://schemas.microsoft.com/office/word/2010/wordprocessingInk" xmlns:wne="http://schemas.microsoft.com/office/word/2006/wordml" xmlns:wps="http://schemas.microsoft.com/office/word/2010/wordprocessingShape"/>
+</file>
+
+<file path=word/endnotes.xml><?xml version="1.0" encoding="utf-8"?>
+<w:endnotes xmlns:wpc="http://schemas.microsoft.com/office/word/2010/wordprocessingCanvas" xmlns:mc="http://schemas.openxmlformats.org/markup-compatibility/2006" xmlns:o="urn:schemas-microsoft-com:office:office" xmlns:r="http://schemas.openxmlformats.org/officeDocument/2006/relationships" xmlns:m="http://schemas.openxmlformats.org/officeDocument/2006/math" xmlns:v="urn:schemas-microsoft-com:vml" xmlns:wp14="http://schemas.microsoft.com/office/word/2010/wordprocessingDrawing" xmlns:wp="http://schemas.openxmlformats.org/drawingml/2006/wordprocessingDrawing" xmlns:w10="urn:schemas-microsoft-com:office:word" xmlns:w="http://schemas.openxmlformats.org/wordprocessingml/2006/main" xmlns:w14="http://schemas.microsoft.com/office/word/2010/wordml" xmlns:w15="http://schemas.microsoft.com/office/word/2012/wordml" xmlns:wpg="http://schemas.microsoft.com/office/word/2010/wordprocessingGroup" xmlns:wpi="http://schemas.microsoft.com/office/word/2010/wordprocessingInk" xmlns:wne="http://schemas.microsoft.com/office/word/2006/wordml" xmlns:wps="http://schemas.microsoft.com/office/word/2010/wordprocessingShape" mc:Ignorable="w14 w15 wp14">
+  <w:endnote w:type="separator" w:id="-1">
+    <w:p>
+      <w:pPr>
+        <w:spacing w:after="0" w:line="240" w:lineRule="auto"/>
+      </w:pPr>
+      <w:r>
+        <w:rPr>
+          <w:rStyle w:val="EndnoteReference"/>
+        </w:rPr>
+        <w:endnoteRef/>
+      </w:r>
+      <w:r>
+        <w:separator/>
+      </w:r>
+    </w:p>
+  </w:endnote>
+  <w:endnote w:type="continuationSeparator" w:id="0">
+    <w:p>
+      <w:pPr>
+        <w:spacing w:after="0" w:line="240" w:lineRule="auto"/>
+      </w:pPr>
+      <w:r>
+        <w:rPr>
+          <w:rStyle w:val="EndnoteReference"/>
+        </w:rPr>
+        <w:endnoteRef/>
+      </w:r>
+      <w:r>
+        <w:continuationSeparator/>
+      </w:r>
+    </w:p>
+  </w:endnote>
+</w:endnotes>
 </file>
 
 <file path=word/footer1.xml><?xml version="1.0" encoding="utf-8"?>
@@ -4975,13 +4055,50 @@
       <w:szCs w:val="20"/>
     </w:rPr>
   </w:style>
+  <w:style w:type="character" w:styleId="EndnoteReference">
+    <w:name w:val="endnote reference"/>
+    <w:basedOn w:val="DefaultParagraphFont"/>
+    <w:uiPriority w:val="99"/>
+    <w:semiHidden/>
+    <w:unhideWhenUsed/>
+    <w:rPr>
+      <w:vertAlign w:val="superscript"/>
+    </w:rPr>
+  </w:style>
+  <w:style w:type="paragraph" w:styleId="EndnoteText">
+    <w:name w:val="endnote text"/>
+    <w:basedOn w:val="Normal"/>
+    <w:link w:val="EndnoteTextChar"/>
+    <w:uiPriority w:val="99"/>
+    <w:semiHidden/>
+    <w:unhideWhenUsed/>
+    <w:pPr>
+      <w:spacing w:after="0" w:line="240" w:lineRule="auto"/>
+    </w:pPr>
+    <w:rPr>
+      <w:sz w:val="20"/>
+      <w:szCs w:val="20"/>
+    </w:rPr>
+  </w:style>
+  <w:style w:type="character" w:styleId="EndnoteTextChar">
+    <w:name w:val="Endnote Text Char"/>
+    <w:basedOn w:val="DefaultParagraphFont"/>
+    <w:link w:val="EndnoteText"/>
+    <w:uiPriority w:val="99"/>
+    <w:semiHidden/>
+    <w:unhideWhenUsed/>
+    <w:rPr>
+      <w:sz w:val="20"/>
+      <w:szCs w:val="20"/>
+    </w:rPr>
+  </w:style>
   <w:style w:type="paragraph" w:styleId="Heading1">
     <w:name w:val="Heading 1"/>
     <w:basedOn w:val="Normal"/>
     <w:next w:val="Normal"/>
     <w:qFormat/>
     <w:pPr>
-      <w:spacing w:before="320" w:after="160" w:line="264"/>
+      <w:spacing w:after="160" w:before="320" w:line="264"/>
     </w:pPr>
     <w:rPr>
       <w:rFonts w:ascii="Calibri" w:cs="Calibri" w:eastAsia="Calibri" w:hAnsi="Calibri"/>
@@ -4998,7 +4115,7 @@
     <w:next w:val="Normal"/>
     <w:qFormat/>
     <w:pPr>
-      <w:spacing w:before="240" w:after="120" w:line="264"/>
+      <w:spacing w:after="120" w:before="240" w:line="264"/>
     </w:pPr>
     <w:rPr>
       <w:rFonts w:ascii="Calibri" w:cs="Calibri" w:eastAsia="Calibri" w:hAnsi="Calibri"/>

</xml_diff>